<commit_message>
dodane pytanie badawcze , bibligrafia
</commit_message>
<xml_diff>
--- a/praca/praca_koncowa.docx
+++ b/praca/praca_koncowa.docx
@@ -149,75 +149,17 @@
         <w:pStyle w:val="FirstParagraph"/>
       </w:pPr>
       <w:r>
-        <w:t xml:space="preserve">Operatorzy telekomunikacyjni, ang. CSP (Communication Service Providers) działają na silnie konkurencyjnym rynku, który wymaga ciągłej redukcji kosztów. Największe nakłady inwestycyjne związane są z zakupem pasma na licytacjach krajowych. Efektywne wykorzystanie tego zasobu decyduje o przewadze konkurencyjnej na rynku usług telekomunikacyjnych. Miarą efektywności użycia pasma jest efektywność spektralna (ang. spectral efficiency), która definiowana jest jako ilość przesłanych bitów na sekundę przypadająca na jednostkę szerokości pasma. Zazwyczaj jest wyrażana w jednostkach bit/s/Hz.</w:t>
-      </w:r>
-    </w:p>
-    <w:p>
-      <w:pPr>
-        <w:pStyle w:val="BodyText"/>
-      </w:pPr>
-      <w:r>
-        <w:t xml:space="preserve">W celu poprawienia efektywności spektralnej operatorzy wykorzystują w sieciach komórkowych technologię Massive MIMO (ang. Multiple Input Multiple Output), która wykorzystuje macierze antenowe o liczbie elementów znacznie przekraczającej liczbę jednocześnie obsługiwanych użytkowników. Dzięki zwielokrotnieniu przestrzennemu (ang. spatial multiplexing) możliwa jest jednoczesna transmisja do wielu użytkowników w tym samym zasobie częstotliwościowym i czasowym, co bezpośrednio zwiększa efektywność spektralną systemu.</w:t>
-      </w:r>
-      <w:r>
-        <w:t xml:space="preserve"> </w:t>
-      </w:r>
-      <w:r>
-        <w:t xml:space="preserve">(Park 2024)</w:t>
-      </w:r>
-    </w:p>
-    <w:p>
-      <w:pPr>
-        <w:pStyle w:val="BodyText"/>
-      </w:pPr>
-      <w:r>
-        <w:t xml:space="preserve">Aby dalej poprawić efektywność spektralną organizacja standaryzująca 3GPP przeprowadziła analizę możliwości wykorzystania uczenia maszynowego w telekomunikacji. W efekcie powstał raport techniczny TR 38.843</w:t>
-      </w:r>
-      <w:r>
-        <w:t xml:space="preserve"> </w:t>
-      </w:r>
-      <w:r>
-        <w:t xml:space="preserve">“</w:t>
-      </w:r>
-      <w:r>
-        <w:t xml:space="preserve">Study on Artificial Intelligence (AI)/Machine Learning (ML) for NR air interface</w:t>
-      </w:r>
-      <w:r>
-        <w:t xml:space="preserve">”</w:t>
-      </w:r>
-      <w:r>
-        <w:t xml:space="preserve">, w którym opisano scenariusz predykcji wiązki w przestrzeni przy wykorzystaniu modeli uczenia maszynowego.</w:t>
-      </w:r>
-    </w:p>
-    <w:p>
-      <w:pPr>
-        <w:pStyle w:val="BodyText"/>
-      </w:pPr>
-      <w:r>
-        <w:t xml:space="preserve">Celem niniejszej pracy jest implementacja opisanego w raporcie TR 38.843 scenariusza predykcji wiązki w przestrzeni z wykorzystaniem bibliotek do uczenia maszynowego w języku Python oraz analiza uzyskanej efektywności spektralnej i porównanie jej z efektywnością spektralną uzyskaną przy wykorzystaniu tradycyjnych metod bazujących na pomiarach pilotowych.</w:t>
-      </w:r>
-      <w:r>
-        <w:t xml:space="preserve">(3GPP 2024)</w:t>
-      </w:r>
-    </w:p>
-    <w:p>
-      <w:pPr>
-        <w:pStyle w:val="BodyText"/>
-      </w:pPr>
-      <w:r>
-        <w:t xml:space="preserve">W pracy wykorzystano zbiór danych wygenerowany za pomocą frameworku DeepMIMO (Arizona State University), opartego na danych z symulacji ray-tracingowych przeprowadzonych w oprogramowaniu Remcom Wireless InSite dla scenariusza 3GPP 5G NR outdoor.</w:t>
-      </w:r>
-      <w:r>
-        <w:t xml:space="preserve"> </w:t>
-      </w:r>
-      <w:r>
-        <w:t xml:space="preserve">(Alkhateeb 2019)</w:t>
-      </w:r>
-    </w:p>
-    <w:p>
-      <w:pPr>
-        <w:pStyle w:val="BodyText"/>
-      </w:pPr>
+        <w:t xml:space="preserve">Problem [opis do zrobienia]</w:t>
+      </w:r>
+      <w:r>
+        <w:t xml:space="preserve"> </w:t>
+      </w:r>
+      <w:r>
+        <w:t xml:space="preserve">Dane [opis do zrobienia]</w:t>
+      </w:r>
+      <w:r>
+        <w:t xml:space="preserve"> </w:t>
+      </w:r>
       <w:r>
         <w:t xml:space="preserve">Metoda [opis do zrobienia]</w:t>
       </w:r>
@@ -281,7 +223,84 @@
         <w:pStyle w:val="FirstParagraph"/>
       </w:pPr>
       <w:r>
-        <w:t xml:space="preserve">[Opis tła problemu, dlaczego temat jest ważny i aktualny…]</w:t>
+        <w:t xml:space="preserve">Operatorzy telekomunikacyjni (ang. Communication Service Providers, CSP) działają na silnie konkurencyjnym rynku, który wymaga ciągłej redukcji kosztów. Największe nakłady inwestycyjne związane są z zakupem pasma na licytacjach krajowych. Efektywne wykorzystanie tego zasobu decyduje o przewadze konkurencyjnej na rynku usług telekomunikacyjnych. Miarą efektywności użycia pasma jest efektywność spektralna (ang. spectral efficiency), która definiowana jest jako przepływność binarna (liczba przesłanych bitów na sekundę) przypadająca na jednostkę szerokości pasma [bit/s/Hz].</w:t>
+      </w:r>
+    </w:p>
+    <w:p>
+      <w:pPr>
+        <w:pStyle w:val="BodyText"/>
+      </w:pPr>
+      <w:r>
+        <w:t xml:space="preserve">W celu poprawy efektywności spektralnej operatorzy wykorzystują w sieciach komórkowych technologię Massive MIMO (ang. Multiple Input Multiple Output), która wykorzystuje macierze antenowe o liczbie elementów znacznie przekraczającej liczbę jednocześnie obsługiwanych użytkowników. Dzięki zwielokrotnieniu przestrzennemu (ang. spatial multiplexing) możliwa jest jednoczesna transmisja do wielu użytkowników w tym samym zasobie częstotliwościowym i czasowym, co bezpośrednio zwiększa efektywność spektralną systemu</w:t>
+      </w:r>
+      <w:r>
+        <w:t xml:space="preserve"> </w:t>
+      </w:r>
+      <w:r>
+        <w:t xml:space="preserve">(Park 2024)</w:t>
+      </w:r>
+      <w:r>
+        <w:t xml:space="preserve">.</w:t>
+      </w:r>
+    </w:p>
+    <w:p>
+      <w:pPr>
+        <w:pStyle w:val="BodyText"/>
+      </w:pPr>
+      <w:r>
+        <w:t xml:space="preserve">Aby dalej poprawić efektywność spektralną, organizacja standaryzująca 3GPP przeprowadziła analizę możliwości wykorzystania uczenia maszynowego w telekomunikacji. W efekcie powstał raport techniczny TR 38.843</w:t>
+      </w:r>
+      <w:r>
+        <w:t xml:space="preserve"> </w:t>
+      </w:r>
+      <w:r>
+        <w:t xml:space="preserve">“</w:t>
+      </w:r>
+      <w:r>
+        <w:t xml:space="preserve">Study on Artificial Intelligence (AI)/Machine Learning (ML) for NR air interface</w:t>
+      </w:r>
+      <w:r>
+        <w:t xml:space="preserve">”</w:t>
+      </w:r>
+      <w:r>
+        <w:t xml:space="preserve">, w którym opisano scenariusz predykcji wiązki w dziedzinie przestrzennej (ang. spatial domain beam prediction), polegający na wyznaczeniu optymalnego wektora kształtowania wiązki na podstawie sygnałów pilotażowych o zredukowanej liczbie pomiarów.</w:t>
+      </w:r>
+    </w:p>
+    <w:p>
+      <w:pPr>
+        <w:pStyle w:val="BodyText"/>
+      </w:pPr>
+      <w:r>
+        <w:t xml:space="preserve">W pracy</w:t>
+      </w:r>
+      <w:r>
+        <w:t xml:space="preserve"> </w:t>
+      </w:r>
+      <w:r>
+        <w:t xml:space="preserve">(Ahmed Alkhateeb et al. 2018)</w:t>
+      </w:r>
+      <w:r>
+        <w:t xml:space="preserve"> </w:t>
+      </w:r>
+      <w:r>
+        <w:t xml:space="preserve">zaproponowano architekturę skoordynowanego kształtowania wiązki z wykorzystaniem głębokich sieci neuronowych dla systemów fal milimetrowych, która pozwala na znaczne ograniczenie narzutu pilotowego. Niniejsza praca nawiązuje do tej metodyki, stanowiąc jej replikację i próbę optymalizacji w wybranym scenariuszu.</w:t>
+      </w:r>
+    </w:p>
+    <w:p>
+      <w:pPr>
+        <w:pStyle w:val="BodyText"/>
+      </w:pPr>
+      <w:r>
+        <w:t xml:space="preserve">W pracy wykorzystano zbiór danych wygenerowany za pomocą frameworku DeepMIMO (Arizona State University), opartego na danych z symulacji ray-tracingowych przeprowadzonych w oprogramowaniu Remcom Wireless InSite dla scenariusza 3GPP 5G NR outdoor</w:t>
+      </w:r>
+      <w:r>
+        <w:t xml:space="preserve"> </w:t>
+      </w:r>
+      <w:r>
+        <w:t xml:space="preserve">(A. Alkhateeb 2019)</w:t>
+      </w:r>
+      <w:r>
+        <w:t xml:space="preserve">.</w:t>
       </w:r>
     </w:p>
     <w:bookmarkEnd w:id="25"/>
@@ -299,7 +318,16 @@
         <w:pStyle w:val="FirstParagraph"/>
       </w:pPr>
       <w:r>
-        <w:t xml:space="preserve">Głównym celem niniejszej pracy jest [opis celu głównego].</w:t>
+        <w:t xml:space="preserve">Głównym celem niniejszej pracy jest implementacja scenariusza predykcji wiązki w dziedzinie przestrzennej (zdefiniowanego w raporcie technicznym 3GPP TR 38.843) z wykorzystaniem modeli uczenia maszynowego w języku Python. Praca obejmuje analizę osiągniętej efektywności spektralnej oraz jej porównanie z metodami konwencjonalnymi, opartymi na wyczerpującym przeszukiwaniu wiązek i pomiarach pilotowych</w:t>
+      </w:r>
+      <w:r>
+        <w:t xml:space="preserve"> </w:t>
+      </w:r>
+      <w:r>
+        <w:t xml:space="preserve">(3GPP 2024)</w:t>
+      </w:r>
+      <w:r>
+        <w:t xml:space="preserve">.</w:t>
       </w:r>
     </w:p>
     <w:p>
@@ -329,51 +357,16 @@
         <w:t xml:space="preserve"> </w:t>
       </w:r>
       <w:r>
-        <w:t xml:space="preserve">[Pierwsze pytanie badawcze…]</w:t>
-      </w:r>
-      <w:r>
-        <w:t xml:space="preserve"> </w:t>
-      </w:r>
-      <w:r>
-        <w:t xml:space="preserve">2.</w:t>
-      </w:r>
-      <w:r>
-        <w:t xml:space="preserve"> </w:t>
-      </w:r>
-      <w:r>
-        <w:rPr>
-          <w:b/>
-          <w:bCs/>
-        </w:rPr>
-        <w:t xml:space="preserve">PB2:</w:t>
-      </w:r>
-      <w:r>
-        <w:t xml:space="preserve"> </w:t>
-      </w:r>
-      <w:r>
-        <w:t xml:space="preserve">[Drugie pytanie badawcze…]</w:t>
-      </w:r>
-      <w:r>
-        <w:t xml:space="preserve"> </w:t>
-      </w:r>
-      <w:r>
-        <w:t xml:space="preserve">3.</w:t>
-      </w:r>
-      <w:r>
-        <w:t xml:space="preserve"> </w:t>
-      </w:r>
-      <w:r>
-        <w:rPr>
-          <w:b/>
-          <w:bCs/>
-        </w:rPr>
-        <w:t xml:space="preserve">PB3:</w:t>
-      </w:r>
-      <w:r>
-        <w:t xml:space="preserve"> </w:t>
-      </w:r>
-      <w:r>
-        <w:t xml:space="preserve">[Trzecie pytanie badawcze…]</w:t>
+        <w:t xml:space="preserve">Czy modyfikacja architektury modelu lub wstępnego przetwarzania cech pozwala uzyskać wyższą efektywność spektralną w porównaniu z rozwiązaniem bazowym przedstawionym przez Alkhateeba i in.</w:t>
+      </w:r>
+      <w:r>
+        <w:t xml:space="preserve"> </w:t>
+      </w:r>
+      <w:r>
+        <w:t xml:space="preserve">(Ahmed Alkhateeb et al. 2018)</w:t>
+      </w:r>
+      <w:r>
+        <w:t xml:space="preserve">?</w:t>
       </w:r>
     </w:p>
     <w:bookmarkEnd w:id="26"/>
@@ -1892,7 +1885,7 @@
     </w:p>
     <w:bookmarkEnd w:id="51"/>
     <w:bookmarkEnd w:id="52"/>
-    <w:bookmarkStart w:id="61" w:name="bibliografia-i-załączniki"/>
+    <w:bookmarkStart w:id="63" w:name="bibliografia-i-załączniki"/>
     <w:p>
       <w:pPr>
         <w:pStyle w:val="Heading1"/>
@@ -2008,7 +2001,7 @@
       </w:r>
     </w:p>
     <w:bookmarkEnd w:id="54"/>
-    <w:bookmarkStart w:id="60" w:name="literatura"/>
+    <w:bookmarkStart w:id="62" w:name="literatura"/>
     <w:p>
       <w:pPr>
         <w:pStyle w:val="Heading2"/>
@@ -2017,7 +2010,7 @@
         <w:t xml:space="preserve">7.3. Literatura</w:t>
       </w:r>
     </w:p>
-    <w:bookmarkStart w:id="59" w:name="refs"/>
+    <w:bookmarkStart w:id="61" w:name="refs"/>
     <w:bookmarkStart w:id="55" w:name="ref-3gpp_tr38843"/>
     <w:p>
       <w:pPr>
@@ -2105,12 +2098,64 @@
       </w:r>
     </w:p>
     <w:bookmarkEnd w:id="56"/>
-    <w:bookmarkStart w:id="58" w:name="ref-sharetechnote_massive_mimo"/>
+    <w:bookmarkStart w:id="58" w:name="ref-alkhateeb2018deep"/>
     <w:p>
       <w:pPr>
         <w:pStyle w:val="Bibliography"/>
       </w:pPr>
       <w:r>
+        <w:t xml:space="preserve">Alkhateeb, Ahmed, Sam Alex, Paul Varkey, Ying Li, Qi Qu, and Djordje Tujkovic. 2018.</w:t>
+      </w:r>
+      <w:r>
+        <w:t xml:space="preserve"> </w:t>
+      </w:r>
+      <w:r>
+        <w:t xml:space="preserve">“</w:t>
+      </w:r>
+      <w:r>
+        <w:t xml:space="preserve">Deep Learning Coordinated Beamforming for Highly-Mobile Millimeter Wave Systems</w:t>
+      </w:r>
+      <w:r>
+        <w:t xml:space="preserve">.”</w:t>
+      </w:r>
+      <w:r>
+        <w:t xml:space="preserve"> </w:t>
+      </w:r>
+      <w:r>
+        <w:rPr>
+          <w:i/>
+          <w:iCs/>
+        </w:rPr>
+        <w:t xml:space="preserve">IEEE Access</w:t>
+      </w:r>
+      <w:r>
+        <w:t xml:space="preserve"> </w:t>
+      </w:r>
+      <w:r>
+        <w:t xml:space="preserve">6: 37328–48.</w:t>
+      </w:r>
+      <w:r>
+        <w:t xml:space="preserve"> </w:t>
+      </w:r>
+      <w:hyperlink r:id="rId57">
+        <w:r>
+          <w:rPr>
+            <w:rStyle w:val="Hyperlink"/>
+          </w:rPr>
+          <w:t xml:space="preserve">https://doi.org/10.1109/ACCESS.2018.2850226</w:t>
+        </w:r>
+      </w:hyperlink>
+      <w:r>
+        <w:t xml:space="preserve">.</w:t>
+      </w:r>
+    </w:p>
+    <w:bookmarkEnd w:id="58"/>
+    <w:bookmarkStart w:id="60" w:name="ref-sharetechnote_massive_mimo"/>
+    <w:p>
+      <w:pPr>
+        <w:pStyle w:val="Bibliography"/>
+      </w:pPr>
+      <w:r>
         <w:t xml:space="preserve">Park, Jaekyun. 2024.</w:t>
       </w:r>
       <w:r>
@@ -2134,7 +2179,7 @@
       <w:r>
         <w:t xml:space="preserve"> </w:t>
       </w:r>
-      <w:hyperlink r:id="rId57">
+      <w:hyperlink r:id="rId59">
         <w:r>
           <w:rPr>
             <w:rStyle w:val="Hyperlink"/>
@@ -2146,15 +2191,15 @@
         <w:t xml:space="preserve">.</w:t>
       </w:r>
     </w:p>
-    <w:bookmarkEnd w:id="58"/>
-    <w:bookmarkEnd w:id="59"/>
-    <w:p>
-      <w:r>
-        <w:br w:type="page"/>
-      </w:r>
-    </w:p>
     <w:bookmarkEnd w:id="60"/>
     <w:bookmarkEnd w:id="61"/>
+    <w:p>
+      <w:r>
+        <w:br w:type="page"/>
+      </w:r>
+    </w:p>
+    <w:bookmarkEnd w:id="62"/>
+    <w:bookmarkEnd w:id="63"/>
     <w:sectPr>
       <w:pgSz w:h="15840" w:w="12240"/>
       <w:pgMar w:bottom="1418" w:footer="720" w:gutter="0" w:header="720" w:left="1418" w:right="1418" w:top="1418"/>

</xml_diff>